<commit_message>
Text bugs and issues.
</commit_message>
<xml_diff>
--- a/final_documents/CO_BLOOM_Table.docx
+++ b/final_documents/CO_BLOOM_Table.docx
@@ -752,30 +752,7 @@
               <w:jc w:val="left"/>
             </w:pPr>
             <w:r>
-              <w:t xml:space="preserve">Explain the relationship between bandgap energy</w:t>
-            </w:r>
-            <w:r>
-              <w:t xml:space="preserve"> </w:t>
-            </w:r>
-            <m:oMath>
-              <m:sSub>
-                <m:e>
-                  <m:r>
-                    <m:t>E</m:t>
-                  </m:r>
-                </m:e>
-                <m:sub>
-                  <m:r>
-                    <m:t>g</m:t>
-                  </m:r>
-                </m:sub>
-              </m:sSub>
-            </m:oMath>
-            <w:r>
-              <w:t xml:space="preserve"> </w:t>
-            </w:r>
-            <w:r>
-              <w:t xml:space="preserve">and temperature in silicon.</w:t>
+              <w:t xml:space="preserve">Explain the working principles of laboratory tools, sensors, and experimental setups used in practical implementations.</w:t>
             </w:r>
           </w:p>
         </w:tc>
@@ -799,7 +776,7 @@
               <w:jc w:val="left"/>
             </w:pPr>
             <w:r>
-              <w:t xml:space="preserve">K2 (AN)</w:t>
+              <w:t xml:space="preserve">K1 (UN)</w:t>
             </w:r>
           </w:p>
         </w:tc>
@@ -833,7 +810,7 @@
               <w:jc w:val="left"/>
             </w:pPr>
             <w:r>
-              <w:t xml:space="preserve">Analyze the impact of short-channel effects in scaled semiconductor devices.</w:t>
+              <w:t xml:space="preserve">Apply appropriate measurement and data acquisition techniques to collect and preprocess experimental data accurately.</w:t>
             </w:r>
           </w:p>
         </w:tc>
@@ -857,7 +834,7 @@
               <w:jc w:val="left"/>
             </w:pPr>
             <w:r>
-              <w:t xml:space="preserve">K1 (RE)</w:t>
+              <w:t xml:space="preserve">K2 (AP)</w:t>
             </w:r>
           </w:p>
         </w:tc>
@@ -891,27 +868,7 @@
               <w:jc w:val="left"/>
             </w:pPr>
             <w:r>
-              <w:t xml:space="preserve">Evaluate the role of energy difference</w:t>
-            </w:r>
-            <w:r>
-              <w:t xml:space="preserve"> </w:t>
-            </w:r>
-            <m:oMath>
-              <m:r>
-                <m:rPr>
-                  <m:sty m:val="p"/>
-                </m:rPr>
-                <m:t>Δ</m:t>
-              </m:r>
-              <m:r>
-                <m:t>E</m:t>
-              </m:r>
-            </m:oMath>
-            <w:r>
-              <w:t xml:space="preserve"> </w:t>
-            </w:r>
-            <w:r>
-              <w:t xml:space="preserve">in carrier transport mechanisms.</w:t>
+              <w:t xml:space="preserve">Analyze the performance of implemented algorithms or systems using relevant metrics and experimental results.</w:t>
             </w:r>
           </w:p>
         </w:tc>
@@ -935,7 +892,65 @@
               <w:jc w:val="left"/>
             </w:pPr>
             <w:r>
-              <w:t xml:space="preserve">K3 (EV)</w:t>
+              <w:t xml:space="preserve">K2 (AN)</w:t>
+            </w:r>
+          </w:p>
+        </w:tc>
+        <w:tc>
+          <w:tcPr/>
+          <w:p>
+            <w:pPr>
+              <w:pStyle w:val="Compact"/>
+            </w:pPr>
+          </w:p>
+        </w:tc>
+      </w:tr>
+      <w:tr>
+        <w:tc>
+          <w:tcPr/>
+          <w:p>
+            <w:pPr>
+              <w:pStyle w:val="Compact"/>
+              <w:jc w:val="left"/>
+            </w:pPr>
+            <w:r>
+              <w:t xml:space="preserve">ECE001.4</w:t>
+            </w:r>
+          </w:p>
+        </w:tc>
+        <w:tc>
+          <w:tcPr/>
+          <w:p>
+            <w:pPr>
+              <w:pStyle w:val="Compact"/>
+              <w:jc w:val="left"/>
+            </w:pPr>
+            <w:r>
+              <w:t xml:space="preserve">Develop and document a complete practical solution by integrating experimentation, analysis, and reporting.</w:t>
+            </w:r>
+          </w:p>
+        </w:tc>
+        <w:tc>
+          <w:tcPr/>
+          <w:p>
+            <w:pPr>
+              <w:pStyle w:val="Compact"/>
+              <w:jc w:val="left"/>
+            </w:pPr>
+            <w:r>
+              <w:t xml:space="preserve">ECE001</w:t>
+            </w:r>
+          </w:p>
+        </w:tc>
+        <w:tc>
+          <w:tcPr/>
+          <w:p>
+            <w:pPr>
+              <w:pStyle w:val="Compact"/>
+              <w:jc w:val="left"/>
+            </w:pPr>
+            <w:r>
+              <w:t xml:space="preserve">K2 (AP)</w:t>
             </w:r>
           </w:p>
         </w:tc>

</xml_diff>